<commit_message>
add tested case with opencsv and manual code
</commit_message>
<xml_diff>
--- a/json-converter/storage/AllCases/ListOfCases.docx
+++ b/json-converter/storage/AllCases/ListOfCases.docx
@@ -225,6 +225,21 @@
           <w:lang w:val="en-US"/>
         </w:rPr>
         <w:t>Case - 15 : large numbers</w:t>
+      </w:r>
+    </w:p>
+    <w:p>
+      <w:pPr>
+        <w:rPr>
+          <w:rFonts w:hint="default"/>
+          <w:lang w:val="en-US"/>
+        </w:rPr>
+      </w:pPr>
+      <w:r>
+        <w:rPr>
+          <w:rFonts w:hint="default"/>
+          <w:lang w:val="en-US"/>
+        </w:rPr>
+        <w:t xml:space="preserve">Case - 16 : root node as object </w:t>
       </w:r>
       <w:bookmarkStart w:id="0" w:name="_GoBack"/>
       <w:bookmarkEnd w:id="0"/>
@@ -353,7 +368,7 @@
     <w:lsdException w:unhideWhenUsed="0" w:uiPriority="0" w:semiHidden="0" w:name="HTML Sample"/>
     <w:lsdException w:unhideWhenUsed="0" w:uiPriority="0" w:semiHidden="0" w:name="HTML Typewriter"/>
     <w:lsdException w:unhideWhenUsed="0" w:uiPriority="0" w:semiHidden="0" w:name="HTML Variable"/>
-    <w:lsdException w:unhideWhenUsed="0" w:uiPriority="0" w:name="Normal Table"/>
+    <w:lsdException w:qFormat="1" w:unhideWhenUsed="0" w:uiPriority="0" w:name="Normal Table"/>
     <w:lsdException w:unhideWhenUsed="0" w:uiPriority="0" w:semiHidden="0" w:name="annotation subject"/>
     <w:lsdException w:unhideWhenUsed="0" w:uiPriority="0" w:semiHidden="0" w:name="Table Simple 1"/>
     <w:lsdException w:unhideWhenUsed="0" w:uiPriority="0" w:semiHidden="0" w:name="Table Simple 2"/>
@@ -516,6 +531,7 @@
   <w:style w:type="table" w:default="1" w:styleId="3">
     <w:name w:val="Normal Table"/>
     <w:semiHidden/>
+    <w:qFormat/>
     <w:uiPriority w:val="0"/>
     <w:tblPr>
       <w:tblCellMar>

</xml_diff>

<commit_message>
2 test case change and code improve of flatten
</commit_message>
<xml_diff>
--- a/json-converter/storage/AllCases/ListOfCases.docx
+++ b/json-converter/storage/AllCases/ListOfCases.docx
@@ -240,6 +240,21 @@
           <w:lang w:val="en-US"/>
         </w:rPr>
         <w:t xml:space="preserve">Case - 16 : root node as object </w:t>
+      </w:r>
+    </w:p>
+    <w:p>
+      <w:pPr>
+        <w:rPr>
+          <w:rFonts w:hint="default"/>
+          <w:lang w:val="en-US"/>
+        </w:rPr>
+      </w:pPr>
+      <w:r>
+        <w:rPr>
+          <w:rFonts w:hint="default"/>
+          <w:lang w:val="en-US"/>
+        </w:rPr>
+        <w:t>Case - 17 : root node as array</w:t>
       </w:r>
       <w:bookmarkStart w:id="0" w:name="_GoBack"/>
       <w:bookmarkEnd w:id="0"/>

</xml_diff>

<commit_message>
add case-18 and solve the case-16
</commit_message>
<xml_diff>
--- a/json-converter/storage/AllCases/ListOfCases.docx
+++ b/json-converter/storage/AllCases/ListOfCases.docx
@@ -241,23 +241,38 @@
         </w:rPr>
         <w:t xml:space="preserve">Case - 16 : root node as object </w:t>
       </w:r>
-    </w:p>
-    <w:p>
-      <w:pPr>
-        <w:rPr>
-          <w:rFonts w:hint="default"/>
-          <w:lang w:val="en-US"/>
-        </w:rPr>
-      </w:pPr>
-      <w:r>
-        <w:rPr>
-          <w:rFonts w:hint="default"/>
-          <w:lang w:val="en-US"/>
-        </w:rPr>
-        <w:t>Case - 17 : root node as array</w:t>
-      </w:r>
       <w:bookmarkStart w:id="0" w:name="_GoBack"/>
       <w:bookmarkEnd w:id="0"/>
+    </w:p>
+    <w:p>
+      <w:pPr>
+        <w:rPr>
+          <w:rFonts w:hint="default"/>
+          <w:lang w:val="en-US"/>
+        </w:rPr>
+      </w:pPr>
+      <w:r>
+        <w:rPr>
+          <w:rFonts w:hint="default"/>
+          <w:lang w:val="en-US"/>
+        </w:rPr>
+        <w:t>Case - 17 : root node as array</w:t>
+      </w:r>
+    </w:p>
+    <w:p>
+      <w:pPr>
+        <w:rPr>
+          <w:rFonts w:hint="default"/>
+          <w:lang w:val="en-US"/>
+        </w:rPr>
+      </w:pPr>
+      <w:r>
+        <w:rPr>
+          <w:rFonts w:hint="default"/>
+          <w:lang w:val="en-US"/>
+        </w:rPr>
+        <w:t>Case - 18 : both object and array are present</w:t>
+      </w:r>
     </w:p>
     <w:sectPr>
       <w:pgSz w:w="11906" w:h="16838"/>

</xml_diff>